<commit_message>
Adjust windows installation guide
</commit_message>
<xml_diff>
--- a/Documentation/Windows Installation.docx
+++ b/Documentation/Windows Installation.docx
@@ -1,6 +1,6 @@
 
 <file path=word/document.xml><?xml version="1.0" encoding="utf-8"?>
-<w:document xmlns:wpc="http://schemas.microsoft.com/office/word/2010/wordprocessingCanvas" xmlns:cx="http://schemas.microsoft.com/office/drawing/2014/chartex" xmlns:cx1="http://schemas.microsoft.com/office/drawing/2015/9/8/chartex" xmlns:cx2="http://schemas.microsoft.com/office/drawing/2015/10/21/chartex" xmlns:cx3="http://schemas.microsoft.com/office/drawing/2016/5/9/chartex" xmlns:cx4="http://schemas.microsoft.com/office/drawing/2016/5/10/chartex" xmlns:cx5="http://schemas.microsoft.com/office/drawing/2016/5/11/chartex" xmlns:cx6="http://schemas.microsoft.com/office/drawing/2016/5/12/chartex" xmlns:cx7="http://schemas.microsoft.com/office/drawing/2016/5/13/chartex" xmlns:cx8="http://schemas.microsoft.com/office/drawing/2016/5/14/chartex" xmlns:mc="http://schemas.openxmlformats.org/markup-compatibility/2006" xmlns:aink="http://schemas.microsoft.com/office/drawing/2016/ink" xmlns:am3d="http://schemas.microsoft.com/office/drawing/2017/model3d" xmlns:o="urn:schemas-microsoft-com:office:office" xmlns:oel="http://schemas.microsoft.com/office/2019/extlst" xmlns:r="http://schemas.openxmlformats.org/officeDocument/2006/relationships" xmlns:m="http://schemas.openxmlformats.org/officeDocument/2006/math" xmlns:v="urn:schemas-microsoft-com:vml" xmlns:wp14="http://schemas.microsoft.com/office/word/2010/wordprocessingDrawing" xmlns:wp="http://schemas.openxmlformats.org/drawingml/2006/wordprocessingDrawing" xmlns:w10="urn:schemas-microsoft-com:office:word" xmlns:w="http://schemas.openxmlformats.org/wordprocessingml/2006/main" xmlns:w14="http://schemas.microsoft.com/office/word/2010/wordml" xmlns:w15="http://schemas.microsoft.com/office/word/2012/wordml" xmlns:w16cex="http://schemas.microsoft.com/office/word/2018/wordml/cex" xmlns:w16cid="http://schemas.microsoft.com/office/word/2016/wordml/cid" xmlns:w16="http://schemas.microsoft.com/office/word/2018/wordml" xmlns:w16du="http://schemas.microsoft.com/office/word/2023/wordml/word16du" xmlns:w16sdtdh="http://schemas.microsoft.com/office/word/2020/wordml/sdtdatahash" xmlns:w16sdtfl="http://schemas.microsoft.com/office/word/2024/wordml/sdtformatlock" xmlns:w16se="http://schemas.microsoft.com/office/word/2015/wordml/symex" xmlns:wpg="http://schemas.microsoft.com/office/word/2010/wordprocessingGroup" xmlns:wpi="http://schemas.microsoft.com/office/word/2010/wordprocessingInk" xmlns:wne="http://schemas.microsoft.com/office/word/2006/wordml" xmlns:wps="http://schemas.microsoft.com/office/word/2010/wordprocessingShape" mc:Ignorable="w14 w15 w16se w16cid w16 w16cex w16sdtdh w16sdtfl w16du wp14">
+<w:document xmlns:wpc="http://schemas.microsoft.com/office/word/2010/wordprocessingCanvas" xmlns:cx="http://schemas.microsoft.com/office/drawing/2014/chartex" xmlns:cx1="http://schemas.microsoft.com/office/drawing/2015/9/8/chartex" xmlns:cx2="http://schemas.microsoft.com/office/drawing/2015/10/21/chartex" xmlns:cx3="http://schemas.microsoft.com/office/drawing/2016/5/9/chartex" xmlns:cx4="http://schemas.microsoft.com/office/drawing/2016/5/10/chartex" xmlns:cx5="http://schemas.microsoft.com/office/drawing/2016/5/11/chartex" xmlns:cx6="http://schemas.microsoft.com/office/drawing/2016/5/12/chartex" xmlns:cx7="http://schemas.microsoft.com/office/drawing/2016/5/13/chartex" xmlns:cx8="http://schemas.microsoft.com/office/drawing/2016/5/14/chartex" xmlns:mc="http://schemas.openxmlformats.org/markup-compatibility/2006" xmlns:m="http://schemas.openxmlformats.org/officeDocument/2006/math" xmlns:aink="http://schemas.microsoft.com/office/drawing/2016/ink" xmlns:am3d="http://schemas.microsoft.com/office/drawing/2017/model3d" xmlns:oel="http://schemas.microsoft.com/office/2019/extlst" xmlns:r="http://schemas.openxmlformats.org/officeDocument/2006/relationships" xmlns:wp14="http://schemas.microsoft.com/office/word/2010/wordprocessingDrawing" xmlns:wp="http://schemas.openxmlformats.org/drawingml/2006/wordprocessingDrawing" xmlns:wpg="http://schemas.microsoft.com/office/word/2010/wordprocessingGroup" xmlns:wpi="http://schemas.microsoft.com/office/word/2010/wordprocessingInk" xmlns:wps="http://schemas.microsoft.com/office/word/2010/wordprocessingShape" xmlns:o="urn:schemas-microsoft-com:office:office" xmlns:v="urn:schemas-microsoft-com:vml" xmlns:w10="urn:schemas-microsoft-com:office:word" xmlns:w="http://schemas.openxmlformats.org/wordprocessingml/2006/main" xmlns:w14="http://schemas.microsoft.com/office/word/2010/wordml" xmlns:w15="http://schemas.microsoft.com/office/word/2012/wordml" xmlns:w16cei="http://schemas.microsoft.com/office/word/2026/wordml/cei" xmlns:w16cex="http://schemas.microsoft.com/office/word/2018/wordml/cex" xmlns:w16cid="http://schemas.microsoft.com/office/word/2016/wordml/cid" xmlns:w16="http://schemas.microsoft.com/office/word/2018/wordml" xmlns:w16sdtdh="http://schemas.microsoft.com/office/word/2020/wordml/sdtdatahash" xmlns:w16sdtfl="http://schemas.microsoft.com/office/word/2024/wordml/sdtformatlock" xmlns:w16se="http://schemas.microsoft.com/office/word/2015/wordml/symex" xmlns:w16du="http://schemas.microsoft.com/office/word/2023/wordml/word16du" xmlns:wne="http://schemas.microsoft.com/office/word/2006/wordml" mc:Ignorable="w14 w15 w16se w16cid w16 w16cex w16sdtdh w16sdtfl w16du wp14">
   <w:body>
     <w:p>
       <w:r>
@@ -37,7 +37,15 @@
         </w:numPr>
       </w:pPr>
       <w:r>
-        <w:t>Run the downloaded Thonny installation file, and choose the default responses throughout the process. </w:t>
+        <w:t xml:space="preserve">Run the downloaded Thonny installation </w:t>
+      </w:r>
+      <w:proofErr w:type="gramStart"/>
+      <w:r>
+        <w:t>file, and</w:t>
+      </w:r>
+      <w:proofErr w:type="gramEnd"/>
+      <w:r>
+        <w:t xml:space="preserve"> choose the default responses throughout the process. </w:t>
       </w:r>
       <w:r>
         <w:rPr>
@@ -55,7 +63,15 @@
         </w:numPr>
       </w:pPr>
       <w:r>
-        <w:t>Now we will add the media computation package to Thonny and configure it for our use. Run the Thonny program, and do the following.</w:t>
+        <w:t xml:space="preserve">Now we will add the media computation package to Thonny and configure it for our use. Run the Thonny </w:t>
+      </w:r>
+      <w:proofErr w:type="gramStart"/>
+      <w:r>
+        <w:t>program, and</w:t>
+      </w:r>
+      <w:proofErr w:type="gramEnd"/>
+      <w:r>
+        <w:t xml:space="preserve"> do the following.</w:t>
       </w:r>
     </w:p>
     <w:p>
@@ -118,13 +134,8 @@
       <w:r>
         <w:t xml:space="preserve">. </w:t>
       </w:r>
-      <w:proofErr w:type="spellStart"/>
-      <w:r>
-        <w:t>Wait</w:t>
-      </w:r>
-      <w:proofErr w:type="spellEnd"/>
-      <w:r>
-        <w:t xml:space="preserve"> for it to complete.</w:t>
+      <w:r>
+        <w:t>Wait for it to complete.</w:t>
       </w:r>
     </w:p>
     <w:p>
@@ -142,29 +153,15 @@
         </w:rPr>
         <w:t xml:space="preserve">pip install </w:t>
       </w:r>
+      <w:proofErr w:type="spellStart"/>
       <w:r>
         <w:rPr>
           <w:i/>
           <w:iCs/>
         </w:rPr>
-        <w:t>mediaComp[</w:t>
-      </w:r>
-      <w:proofErr w:type="spellStart"/>
-      <w:r>
-        <w:rPr>
-          <w:i/>
-          <w:iCs/>
-        </w:rPr>
-        <w:t>gui</w:t>
+        <w:t>mediaComp</w:t>
       </w:r>
       <w:proofErr w:type="spellEnd"/>
-      <w:r>
-        <w:rPr>
-          <w:i/>
-          <w:iCs/>
-        </w:rPr>
-        <w:t>]</w:t>
-      </w:r>
     </w:p>
     <w:p>
       <w:pPr>
@@ -177,13 +174,7 @@
         <w:t xml:space="preserve">Once the installation is complete, type </w:t>
       </w:r>
       <w:r>
-        <w:t xml:space="preserve">exit, and press enter. The </w:t>
-      </w:r>
-      <w:r>
-        <w:t>System Shell window</w:t>
-      </w:r>
-      <w:r>
-        <w:t xml:space="preserve"> should close.</w:t>
+        <w:t>exit, and press enter. The System Shell window should close.</w:t>
       </w:r>
     </w:p>
     <w:p>
@@ -238,7 +229,7 @@
 </file>
 
 <file path=word/numbering.xml><?xml version="1.0" encoding="utf-8"?>
-<w:numbering xmlns:wpc="http://schemas.microsoft.com/office/word/2010/wordprocessingCanvas" xmlns:cx="http://schemas.microsoft.com/office/drawing/2014/chartex" xmlns:cx1="http://schemas.microsoft.com/office/drawing/2015/9/8/chartex" xmlns:cx2="http://schemas.microsoft.com/office/drawing/2015/10/21/chartex" xmlns:cx3="http://schemas.microsoft.com/office/drawing/2016/5/9/chartex" xmlns:cx4="http://schemas.microsoft.com/office/drawing/2016/5/10/chartex" xmlns:cx5="http://schemas.microsoft.com/office/drawing/2016/5/11/chartex" xmlns:cx6="http://schemas.microsoft.com/office/drawing/2016/5/12/chartex" xmlns:cx7="http://schemas.microsoft.com/office/drawing/2016/5/13/chartex" xmlns:cx8="http://schemas.microsoft.com/office/drawing/2016/5/14/chartex" xmlns:mc="http://schemas.openxmlformats.org/markup-compatibility/2006" xmlns:aink="http://schemas.microsoft.com/office/drawing/2016/ink" xmlns:am3d="http://schemas.microsoft.com/office/drawing/2017/model3d" xmlns:o="urn:schemas-microsoft-com:office:office" xmlns:oel="http://schemas.microsoft.com/office/2019/extlst" xmlns:r="http://schemas.openxmlformats.org/officeDocument/2006/relationships" xmlns:m="http://schemas.openxmlformats.org/officeDocument/2006/math" xmlns:v="urn:schemas-microsoft-com:vml" xmlns:wp14="http://schemas.microsoft.com/office/word/2010/wordprocessingDrawing" xmlns:wp="http://schemas.openxmlformats.org/drawingml/2006/wordprocessingDrawing" xmlns:w10="urn:schemas-microsoft-com:office:word" xmlns:w="http://schemas.openxmlformats.org/wordprocessingml/2006/main" xmlns:w14="http://schemas.microsoft.com/office/word/2010/wordml" xmlns:w15="http://schemas.microsoft.com/office/word/2012/wordml" xmlns:w16cex="http://schemas.microsoft.com/office/word/2018/wordml/cex" xmlns:w16cid="http://schemas.microsoft.com/office/word/2016/wordml/cid" xmlns:w16="http://schemas.microsoft.com/office/word/2018/wordml" xmlns:w16du="http://schemas.microsoft.com/office/word/2023/wordml/word16du" xmlns:w16sdtdh="http://schemas.microsoft.com/office/word/2020/wordml/sdtdatahash" xmlns:w16sdtfl="http://schemas.microsoft.com/office/word/2024/wordml/sdtformatlock" xmlns:w16se="http://schemas.microsoft.com/office/word/2015/wordml/symex" xmlns:wpg="http://schemas.microsoft.com/office/word/2010/wordprocessingGroup" xmlns:wpi="http://schemas.microsoft.com/office/word/2010/wordprocessingInk" xmlns:wne="http://schemas.microsoft.com/office/word/2006/wordml" xmlns:wps="http://schemas.microsoft.com/office/word/2010/wordprocessingShape" mc:Ignorable="w14 w15 w16se w16cid w16 w16cex w16sdtdh w16sdtfl w16du wp14">
+<w:numbering xmlns:wpc="http://schemas.microsoft.com/office/word/2010/wordprocessingCanvas" xmlns:cx="http://schemas.microsoft.com/office/drawing/2014/chartex" xmlns:cx1="http://schemas.microsoft.com/office/drawing/2015/9/8/chartex" xmlns:cx2="http://schemas.microsoft.com/office/drawing/2015/10/21/chartex" xmlns:cx3="http://schemas.microsoft.com/office/drawing/2016/5/9/chartex" xmlns:cx4="http://schemas.microsoft.com/office/drawing/2016/5/10/chartex" xmlns:cx5="http://schemas.microsoft.com/office/drawing/2016/5/11/chartex" xmlns:cx6="http://schemas.microsoft.com/office/drawing/2016/5/12/chartex" xmlns:cx7="http://schemas.microsoft.com/office/drawing/2016/5/13/chartex" xmlns:cx8="http://schemas.microsoft.com/office/drawing/2016/5/14/chartex" xmlns:mc="http://schemas.openxmlformats.org/markup-compatibility/2006" xmlns:m="http://schemas.openxmlformats.org/officeDocument/2006/math" xmlns:aink="http://schemas.microsoft.com/office/drawing/2016/ink" xmlns:am3d="http://schemas.microsoft.com/office/drawing/2017/model3d" xmlns:oel="http://schemas.microsoft.com/office/2019/extlst" xmlns:r="http://schemas.openxmlformats.org/officeDocument/2006/relationships" xmlns:wp14="http://schemas.microsoft.com/office/word/2010/wordprocessingDrawing" xmlns:wp="http://schemas.openxmlformats.org/drawingml/2006/wordprocessingDrawing" xmlns:wpg="http://schemas.microsoft.com/office/word/2010/wordprocessingGroup" xmlns:wpi="http://schemas.microsoft.com/office/word/2010/wordprocessingInk" xmlns:wps="http://schemas.microsoft.com/office/word/2010/wordprocessingShape" xmlns:o="urn:schemas-microsoft-com:office:office" xmlns:v="urn:schemas-microsoft-com:vml" xmlns:w10="urn:schemas-microsoft-com:office:word" xmlns:w="http://schemas.openxmlformats.org/wordprocessingml/2006/main" xmlns:w14="http://schemas.microsoft.com/office/word/2010/wordml" xmlns:w15="http://schemas.microsoft.com/office/word/2012/wordml" xmlns:w16cei="http://schemas.microsoft.com/office/word/2026/wordml/cei" xmlns:w16cex="http://schemas.microsoft.com/office/word/2018/wordml/cex" xmlns:w16cid="http://schemas.microsoft.com/office/word/2016/wordml/cid" xmlns:w16="http://schemas.microsoft.com/office/word/2018/wordml" xmlns:w16sdtdh="http://schemas.microsoft.com/office/word/2020/wordml/sdtdatahash" xmlns:w16sdtfl="http://schemas.microsoft.com/office/word/2024/wordml/sdtformatlock" xmlns:w16se="http://schemas.microsoft.com/office/word/2015/wordml/symex" xmlns:w16du="http://schemas.microsoft.com/office/word/2023/wordml/word16du" xmlns:wne="http://schemas.microsoft.com/office/word/2006/wordml" mc:Ignorable="w14 w15 w16se w16cid w16 w16cex w16sdtdh w16sdtfl w16du wp14">
   <w:abstractNum w:abstractNumId="0" w15:restartNumberingAfterBreak="0">
     <w:nsid w:val="13F72CC6"/>
     <w:multiLevelType w:val="multilevel"/>
@@ -359,7 +350,7 @@
 </file>
 
 <file path=word/styles.xml><?xml version="1.0" encoding="utf-8"?>
-<w:styles xmlns:mc="http://schemas.openxmlformats.org/markup-compatibility/2006" xmlns:r="http://schemas.openxmlformats.org/officeDocument/2006/relationships" xmlns:w="http://schemas.openxmlformats.org/wordprocessingml/2006/main" xmlns:w14="http://schemas.microsoft.com/office/word/2010/wordml" xmlns:w15="http://schemas.microsoft.com/office/word/2012/wordml" xmlns:w16cex="http://schemas.microsoft.com/office/word/2018/wordml/cex" xmlns:w16cid="http://schemas.microsoft.com/office/word/2016/wordml/cid" xmlns:w16="http://schemas.microsoft.com/office/word/2018/wordml" xmlns:w16du="http://schemas.microsoft.com/office/word/2023/wordml/word16du" xmlns:w16sdtdh="http://schemas.microsoft.com/office/word/2020/wordml/sdtdatahash" xmlns:w16sdtfl="http://schemas.microsoft.com/office/word/2024/wordml/sdtformatlock" xmlns:w16se="http://schemas.microsoft.com/office/word/2015/wordml/symex" mc:Ignorable="w14 w15 w16se w16cid w16 w16cex w16sdtdh w16sdtfl w16du">
+<w:styles xmlns:mc="http://schemas.openxmlformats.org/markup-compatibility/2006" xmlns:r="http://schemas.openxmlformats.org/officeDocument/2006/relationships" xmlns:w="http://schemas.openxmlformats.org/wordprocessingml/2006/main" xmlns:w14="http://schemas.microsoft.com/office/word/2010/wordml" xmlns:w15="http://schemas.microsoft.com/office/word/2012/wordml" xmlns:w16cex="http://schemas.microsoft.com/office/word/2018/wordml/cex" xmlns:w16cid="http://schemas.microsoft.com/office/word/2016/wordml/cid" xmlns:w16="http://schemas.microsoft.com/office/word/2018/wordml" xmlns:w16sdtdh="http://schemas.microsoft.com/office/word/2020/wordml/sdtdatahash" xmlns:w16sdtfl="http://schemas.microsoft.com/office/word/2024/wordml/sdtformatlock" xmlns:w16se="http://schemas.microsoft.com/office/word/2015/wordml/symex" xmlns:w16du="http://schemas.microsoft.com/office/word/2023/wordml/word16du" mc:Ignorable="w14 w15 w16se w16cid w16 w16cex w16sdtdh w16sdtfl w16du">
   <w:docDefaults>
     <w:rPrDefault>
       <w:rPr>

</xml_diff>